<commit_message>
docs(report): update submission report with full workflow guide compliance and 8 image placeholders
</commit_message>
<xml_diff>
--- a/docs/lab-02/LAB2_SUBMISSION_REPORT.docx
+++ b/docs/lab-02/LAB2_SUBMISSION_REPORT.docx
@@ -393,7 +393,7 @@
           <w:b/>
           <w:sz w:val="20"/>
         </w:rPr>
-        <w:t>GitHub Project (Kanban):</w:t>
+        <w:t>GitHub Project (Kanban Board):</w:t>
       </w:r>
       <w:r>
         <w:rPr>
@@ -426,7 +426,7 @@
           <w:b/>
           <w:sz w:val="20"/>
         </w:rPr>
-        <w:t>GitHub Issues:</w:t>
+        <w:t>GitHub Issues (All 10 Lab 2 Features):</w:t>
       </w:r>
       <w:r>
         <w:rPr>
@@ -750,7 +750,256 @@
           <w:color w:val="1E293B"/>
           <w:sz w:val="26"/>
         </w:rPr>
-        <w:t>2. GitHub Project Board Evidence (Kanban)</w:t>
+        <w:t>2. GitHub Project Board Evidence &amp; Workflow Rules</w:t>
+      </w:r>
+    </w:p>
+    <w:p>
+      <w:pPr>
+        <w:pStyle w:val="Heading3"/>
+        <w:spacing w:before="200" w:after="40"/>
+      </w:pPr>
+      <w:r>
+        <w:rPr>
+          <w:rFonts w:ascii="Arial" w:hAnsi="Arial"/>
+          <w:b/>
+          <w:color w:val="475569"/>
+          <w:sz w:val="22"/>
+        </w:rPr>
+        <w:t>Project Board Column Definition &amp; Status Transition Rules</w:t>
+      </w:r>
+    </w:p>
+    <w:p>
+      <w:pPr>
+        <w:spacing w:before="0" w:after="80" w:line="276" w:lineRule="auto"/>
+      </w:pPr>
+      <w:r>
+        <w:rPr>
+          <w:rFonts w:ascii="Arial" w:hAnsi="Arial"/>
+          <w:sz w:val="20"/>
+        </w:rPr>
+        <w:t>Following the TokTickIT GitHub Workflow Guide, the board enforces 6 distinct card statuses in exact order:</w:t>
+      </w:r>
+    </w:p>
+    <w:p>
+      <w:pPr>
+        <w:spacing w:before="0" w:after="80" w:line="276" w:lineRule="auto"/>
+      </w:pPr>
+      <w:r>
+        <w:rPr>
+          <w:rFonts w:ascii="Arial" w:hAnsi="Arial"/>
+          <w:sz w:val="20"/>
+        </w:rPr>
+        <w:t xml:space="preserve">1. </w:t>
+      </w:r>
+      <w:r>
+        <w:rPr>
+          <w:rFonts w:ascii="Arial" w:hAnsi="Arial"/>
+          <w:b/>
+          <w:sz w:val="20"/>
+        </w:rPr>
+        <w:t>Backlog</w:t>
+      </w:r>
+      <w:r>
+        <w:rPr>
+          <w:rFonts w:ascii="Arial" w:hAnsi="Arial"/>
+          <w:sz w:val="20"/>
+        </w:rPr>
+        <w:t>: The Issue has been created on GitHub but has not yet been reviewed and understood.</w:t>
+      </w:r>
+    </w:p>
+    <w:p>
+      <w:pPr>
+        <w:spacing w:before="0" w:after="80" w:line="276" w:lineRule="auto"/>
+      </w:pPr>
+      <w:r>
+        <w:rPr>
+          <w:rFonts w:ascii="Arial" w:hAnsi="Arial"/>
+          <w:sz w:val="20"/>
+        </w:rPr>
+        <w:t xml:space="preserve">2. </w:t>
+      </w:r>
+      <w:r>
+        <w:rPr>
+          <w:rFonts w:ascii="Arial" w:hAnsi="Arial"/>
+          <w:b/>
+          <w:sz w:val="20"/>
+        </w:rPr>
+        <w:t>Specified</w:t>
+      </w:r>
+      <w:r>
+        <w:rPr>
+          <w:rFonts w:ascii="Arial" w:hAnsi="Arial"/>
+          <w:sz w:val="20"/>
+        </w:rPr>
+        <w:t>: The Issue requirements, acceptance criteria, and contracts have been thoroughly read and understood.</w:t>
+      </w:r>
+    </w:p>
+    <w:p>
+      <w:pPr>
+        <w:spacing w:before="0" w:after="80" w:line="276" w:lineRule="auto"/>
+      </w:pPr>
+      <w:r>
+        <w:rPr>
+          <w:rFonts w:ascii="Arial" w:hAnsi="Arial"/>
+          <w:sz w:val="20"/>
+        </w:rPr>
+        <w:t xml:space="preserve">3. </w:t>
+      </w:r>
+      <w:r>
+        <w:rPr>
+          <w:rFonts w:ascii="Arial" w:hAnsi="Arial"/>
+          <w:b/>
+          <w:sz w:val="20"/>
+        </w:rPr>
+        <w:t>Started</w:t>
+      </w:r>
+      <w:r>
+        <w:rPr>
+          <w:rFonts w:ascii="Arial" w:hAnsi="Arial"/>
+          <w:sz w:val="20"/>
+        </w:rPr>
+        <w:t>: The feature branch (</w:t>
+      </w:r>
+      <w:r>
+        <w:rPr>
+          <w:rFonts w:ascii="Arial" w:hAnsi="Arial"/>
+          <w:color w:val="006B3C"/>
+          <w:sz w:val="20"/>
+        </w:rPr>
+        <w:t>feature/&lt;seq&gt;-&lt;name&gt;</w:t>
+      </w:r>
+      <w:r>
+        <w:rPr>
+          <w:rFonts w:ascii="Arial" w:hAnsi="Arial"/>
+          <w:sz w:val="20"/>
+        </w:rPr>
+        <w:t xml:space="preserve">) has been created off </w:t>
+      </w:r>
+      <w:r>
+        <w:rPr>
+          <w:rFonts w:ascii="Arial" w:hAnsi="Arial"/>
+          <w:color w:val="006B3C"/>
+          <w:sz w:val="20"/>
+        </w:rPr>
+        <w:t>lab2-staging</w:t>
+      </w:r>
+      <w:r>
+        <w:rPr>
+          <w:rFonts w:ascii="Arial" w:hAnsi="Arial"/>
+          <w:sz w:val="20"/>
+        </w:rPr>
+        <w:t xml:space="preserve"> and implementation has begun.</w:t>
+      </w:r>
+    </w:p>
+    <w:p>
+      <w:pPr>
+        <w:spacing w:before="0" w:after="80" w:line="276" w:lineRule="auto"/>
+      </w:pPr>
+      <w:r>
+        <w:rPr>
+          <w:rFonts w:ascii="Arial" w:hAnsi="Arial"/>
+          <w:sz w:val="20"/>
+        </w:rPr>
+        <w:t xml:space="preserve">4. </w:t>
+      </w:r>
+      <w:r>
+        <w:rPr>
+          <w:rFonts w:ascii="Arial" w:hAnsi="Arial"/>
+          <w:b/>
+          <w:sz w:val="20"/>
+        </w:rPr>
+        <w:t>PR Review</w:t>
+      </w:r>
+      <w:r>
+        <w:rPr>
+          <w:rFonts w:ascii="Arial" w:hAnsi="Arial"/>
+          <w:sz w:val="20"/>
+        </w:rPr>
+        <w:t xml:space="preserve">: The Pull Request to </w:t>
+      </w:r>
+      <w:r>
+        <w:rPr>
+          <w:rFonts w:ascii="Arial" w:hAnsi="Arial"/>
+          <w:color w:val="006B3C"/>
+          <w:sz w:val="20"/>
+        </w:rPr>
+        <w:t>lab2-staging</w:t>
+      </w:r>
+      <w:r>
+        <w:rPr>
+          <w:rFonts w:ascii="Arial" w:hAnsi="Arial"/>
+          <w:sz w:val="20"/>
+        </w:rPr>
+        <w:t xml:space="preserve"> is open and linked to the Issue via the Development panel, and the peer reviewer (@Suprawi5227) is reviewing the code.</w:t>
+      </w:r>
+    </w:p>
+    <w:p>
+      <w:pPr>
+        <w:spacing w:before="0" w:after="80" w:line="276" w:lineRule="auto"/>
+      </w:pPr>
+      <w:r>
+        <w:rPr>
+          <w:rFonts w:ascii="Arial" w:hAnsi="Arial"/>
+          <w:sz w:val="20"/>
+        </w:rPr>
+        <w:t xml:space="preserve">5. </w:t>
+      </w:r>
+      <w:r>
+        <w:rPr>
+          <w:rFonts w:ascii="Arial" w:hAnsi="Arial"/>
+          <w:b/>
+          <w:sz w:val="20"/>
+        </w:rPr>
+        <w:t>Fixing</w:t>
+      </w:r>
+      <w:r>
+        <w:rPr>
+          <w:rFonts w:ascii="Arial" w:hAnsi="Arial"/>
+          <w:sz w:val="20"/>
+        </w:rPr>
+        <w:t>: Review changes were requested or tests failed; corrections are actively being made on the feature branch.</w:t>
+      </w:r>
+    </w:p>
+    <w:p>
+      <w:pPr>
+        <w:spacing w:before="0" w:after="80" w:line="276" w:lineRule="auto"/>
+      </w:pPr>
+      <w:r>
+        <w:rPr>
+          <w:rFonts w:ascii="Arial" w:hAnsi="Arial"/>
+          <w:sz w:val="20"/>
+        </w:rPr>
+        <w:t xml:space="preserve">6. </w:t>
+      </w:r>
+      <w:r>
+        <w:rPr>
+          <w:rFonts w:ascii="Arial" w:hAnsi="Arial"/>
+          <w:b/>
+          <w:sz w:val="20"/>
+        </w:rPr>
+        <w:t>Done</w:t>
+      </w:r>
+      <w:r>
+        <w:rPr>
+          <w:rFonts w:ascii="Arial" w:hAnsi="Arial"/>
+          <w:sz w:val="20"/>
+        </w:rPr>
+        <w:t xml:space="preserve">: The Pull Request is approved by peer reviewer, all automated tests pass, the PR is merged into </w:t>
+      </w:r>
+      <w:r>
+        <w:rPr>
+          <w:rFonts w:ascii="Arial" w:hAnsi="Arial"/>
+          <w:color w:val="006B3C"/>
+          <w:sz w:val="20"/>
+        </w:rPr>
+        <w:t>lab2-staging</w:t>
+      </w:r>
+      <w:r>
+        <w:rPr>
+          <w:rFonts w:ascii="Arial" w:hAnsi="Arial"/>
+          <w:sz w:val="20"/>
+        </w:rPr>
+        <w:t>, and all Acceptance Criteria are satisfied.</w:t>
       </w:r>
     </w:p>
     <w:tbl>
@@ -790,7 +1039,7 @@
                 <w:color w:val="1E293B"/>
                 <w:sz w:val="19"/>
               </w:rPr>
-              <w:t>**[🖼️ แนบภาพ Screenshot: GitHub Project Kanban Board]**</w:t>
+              <w:t>**[🖼️ จุดใส่รูปภาพที่ 1: แคปหน้าจอ GitHub Project Kanban Board ของคุณที่มีการ์ดอยู่ในคอลัมน์ต่างๆ / Done]**</w:t>
             </w:r>
           </w:p>
         </w:tc>
@@ -901,6 +1150,49 @@
               <w:t xml:space="preserve">| |/  </w:t>
               <w:br/>
               <w:t>| *   fb97b12 Merge pull request #26 from natthakamol1130/feature/7-create-ticket-ui</w:t>
+            </w:r>
+          </w:p>
+        </w:tc>
+      </w:tr>
+    </w:tbl>
+    <w:tbl>
+      <w:tblPr>
+        <w:tblW w:type="auto" w:w="0"/>
+        <w:jc w:val="center"/>
+        <w:tblLook w:firstColumn="1" w:firstRow="1" w:lastColumn="0" w:lastRow="0" w:noHBand="0" w:noVBand="1" w:val="04A0"/>
+      </w:tblPr>
+      <w:tblGrid>
+        <w:gridCol w:w="9360"/>
+      </w:tblGrid>
+      <w:tr>
+        <w:tc>
+          <w:tcPr>
+            <w:tcW w:type="dxa" w:w="9360"/>
+            <w:shd w:fill="F1F5F9"/>
+            <w:tcMar>
+              <w:top w:w="120" w:type="dxa"/>
+              <w:bottom w:w="120" w:type="dxa"/>
+              <w:left w:w="200" w:type="dxa"/>
+              <w:right w:w="200" w:type="dxa"/>
+            </w:tcMar>
+            <w:tcBorders>
+              <w:left w:val="single" w:sz="24" w:space="0" w:color="006B3C"/>
+              <w:top w:val="none"/>
+              <w:right w:val="none"/>
+              <w:bottom w:val="none"/>
+            </w:tcBorders>
+          </w:tcPr>
+          <w:p>
+            <w:pPr>
+              <w:spacing w:before="40" w:after="40" w:line="276" w:lineRule="auto"/>
+            </w:pPr>
+            <w:r>
+              <w:rPr>
+                <w:rFonts w:ascii="Consolas" w:hAnsi="Consolas"/>
+                <w:color w:val="1E293B"/>
+                <w:sz w:val="19"/>
+              </w:rPr>
+              <w:t>**[🖼️ จุดใส่รูปภาพที่ 2: แคปหน้าจอ Terminal ตอนรันคำสั่ง git log --oneline --graph -n 25 บนสาขา main]**</w:t>
             </w:r>
           </w:p>
         </w:tc>
@@ -1328,6 +1620,26 @@
           <w:sz w:val="20"/>
         </w:rPr>
         <w:t>RequesterTicketDetail.test.tsx</w:t>
+      </w:r>
+    </w:p>
+    <w:p>
+      <w:pPr>
+        <w:spacing w:before="0" w:after="80" w:line="276" w:lineRule="auto"/>
+      </w:pPr>
+      <w:r>
+        <w:rPr>
+          <w:rFonts w:ascii="Arial" w:hAnsi="Arial"/>
+          <w:sz w:val="20"/>
+        </w:rPr>
+        <w:t xml:space="preserve">    - </w:t>
+      </w:r>
+      <w:r>
+        <w:rPr>
+          <w:rFonts w:ascii="Arial" w:hAnsi="Arial"/>
+          <w:color w:val="006B3C"/>
+          <w:sz w:val="20"/>
+        </w:rPr>
+        <w:t>tsconfig.json</w:t>
       </w:r>
     </w:p>
     <w:p>
@@ -1814,6 +2126,26 @@
     </w:p>
     <w:p>
       <w:pPr>
+        <w:spacing w:before="0" w:after="80" w:line="276" w:lineRule="auto"/>
+      </w:pPr>
+      <w:r>
+        <w:rPr>
+          <w:rFonts w:ascii="Arial" w:hAnsi="Arial"/>
+          <w:sz w:val="20"/>
+        </w:rPr>
+        <w:t xml:space="preserve">    - </w:t>
+      </w:r>
+      <w:r>
+        <w:rPr>
+          <w:rFonts w:ascii="Arial" w:hAnsi="Arial"/>
+          <w:color w:val="006B3C"/>
+          <w:sz w:val="20"/>
+        </w:rPr>
+        <w:t>LAB2_SUBMISSION_REPORT.docx</w:t>
+      </w:r>
+    </w:p>
+    <w:p>
+      <w:pPr>
         <w:pStyle w:val="ListBullet"/>
         <w:spacing w:before="0" w:after="60"/>
       </w:pPr>
@@ -1840,6 +2172,49 @@
         <w:t>README.md</w:t>
       </w:r>
     </w:p>
+    <w:tbl>
+      <w:tblPr>
+        <w:tblW w:type="auto" w:w="0"/>
+        <w:jc w:val="center"/>
+        <w:tblLook w:firstColumn="1" w:firstRow="1" w:lastColumn="0" w:lastRow="0" w:noHBand="0" w:noVBand="1" w:val="04A0"/>
+      </w:tblPr>
+      <w:tblGrid>
+        <w:gridCol w:w="9360"/>
+      </w:tblGrid>
+      <w:tr>
+        <w:tc>
+          <w:tcPr>
+            <w:tcW w:type="dxa" w:w="9360"/>
+            <w:shd w:fill="F1F5F9"/>
+            <w:tcMar>
+              <w:top w:w="120" w:type="dxa"/>
+              <w:bottom w:w="120" w:type="dxa"/>
+              <w:left w:w="200" w:type="dxa"/>
+              <w:right w:w="200" w:type="dxa"/>
+            </w:tcMar>
+            <w:tcBorders>
+              <w:left w:val="single" w:sz="24" w:space="0" w:color="006B3C"/>
+              <w:top w:val="none"/>
+              <w:right w:val="none"/>
+              <w:bottom w:val="none"/>
+            </w:tcBorders>
+          </w:tcPr>
+          <w:p>
+            <w:pPr>
+              <w:spacing w:before="40" w:after="40" w:line="276" w:lineRule="auto"/>
+            </w:pPr>
+            <w:r>
+              <w:rPr>
+                <w:rFonts w:ascii="Consolas" w:hAnsi="Consolas"/>
+                <w:color w:val="1E293B"/>
+                <w:sz w:val="19"/>
+              </w:rPr>
+              <w:t>**[🖼️ จุดใส่รูปภาพที่ 3: แคปหน้าจอ VS Code File Explorer แสดงโครงสร้างโฟลเดอร์ของโปรเจกต์]**</w:t>
+            </w:r>
+          </w:p>
+        </w:tc>
+      </w:tr>
+    </w:tbl>
     <w:p>
       <w:pPr>
         <w:spacing w:before="120" w:after="120"/>
@@ -1984,7 +2359,147 @@
           <w:color w:val="1E293B"/>
           <w:sz w:val="26"/>
         </w:rPr>
-        <w:t>6. Rendered `docs/lab-02/reviewer.md` (Peer Reviewer Log)</w:t>
+        <w:t>6. Rendered `README.md` Content</w:t>
+      </w:r>
+    </w:p>
+    <w:tbl>
+      <w:tblPr>
+        <w:tblW w:type="auto" w:w="0"/>
+        <w:jc w:val="center"/>
+        <w:tblLook w:firstColumn="1" w:firstRow="1" w:lastColumn="0" w:lastRow="0" w:noHBand="0" w:noVBand="1" w:val="04A0"/>
+      </w:tblPr>
+      <w:tblGrid>
+        <w:gridCol w:w="9360"/>
+      </w:tblGrid>
+      <w:tr>
+        <w:tc>
+          <w:tcPr>
+            <w:tcW w:type="dxa" w:w="9360"/>
+            <w:shd w:fill="F1F5F9"/>
+            <w:tcMar>
+              <w:top w:w="120" w:type="dxa"/>
+              <w:bottom w:w="120" w:type="dxa"/>
+              <w:left w:w="200" w:type="dxa"/>
+              <w:right w:w="200" w:type="dxa"/>
+            </w:tcMar>
+            <w:tcBorders>
+              <w:left w:val="single" w:sz="24" w:space="0" w:color="006B3C"/>
+              <w:top w:val="none"/>
+              <w:right w:val="none"/>
+              <w:bottom w:val="none"/>
+            </w:tcBorders>
+          </w:tcPr>
+          <w:p>
+            <w:pPr>
+              <w:spacing w:before="40" w:after="40" w:line="276" w:lineRule="auto"/>
+            </w:pPr>
+            <w:r>
+              <w:rPr>
+                <w:rFonts w:ascii="Consolas" w:hAnsi="Consolas"/>
+                <w:color w:val="1E293B"/>
+                <w:sz w:val="19"/>
+              </w:rPr>
+              <w:t># TokTickIT - IT Service Desk Application (Lab 2)</w:t>
+              <w:br/>
+              <w:br/>
+              <w:t>TokTickIT is an IT service desk web application built using Spec-Driven Development (Spec DD) and Test-Driven Development (TDD) for CPE 334.</w:t>
+              <w:br/>
+              <w:br/>
+              <w:t>## Tech Stack</w:t>
+              <w:br/>
+              <w:t>- **Frontend**: React, TypeScript, Vite, Bootstrap (Zen Green Theme `#006B3C`)</w:t>
+              <w:br/>
+              <w:t>- **Backend**: Node.js, Express, TypeScript, Prisma ORM</w:t>
+              <w:br/>
+              <w:t>- **Database**: PostgreSQL</w:t>
+              <w:br/>
+              <w:t>- **Testing**: Vitest, Supertest, React Testing Library, Playwright E2E</w:t>
+              <w:br/>
+              <w:br/>
+              <w:t>## Getting Started</w:t>
+              <w:br/>
+              <w:br/>
+              <w:t>### 1. Backend Setup</w:t>
+              <w:br/>
+              <w:t>1. Navigate to the server directory:</w:t>
+              <w:br/>
+              <w:t xml:space="preserve">   ```bash</w:t>
+              <w:br/>
+              <w:t xml:space="preserve">   cd server</w:t>
+              <w:br/>
+              <w:t xml:space="preserve">   ```</w:t>
+              <w:br/>
+              <w:t>2. Install dependencies:</w:t>
+              <w:br/>
+              <w:t xml:space="preserve">   ```bash</w:t>
+              <w:br/>
+              <w:t xml:space="preserve">   npm install</w:t>
+              <w:br/>
+              <w:t xml:space="preserve">   ```</w:t>
+              <w:br/>
+              <w:t>3. Run migrations and seed the database:</w:t>
+              <w:br/>
+              <w:t xml:space="preserve">   ```bash</w:t>
+              <w:br/>
+              <w:t xml:space="preserve">   npx prisma migrate dev --name init_lab2</w:t>
+              <w:br/>
+              <w:t xml:space="preserve">   npx prisma db seed</w:t>
+              <w:br/>
+              <w:t xml:space="preserve">   ```</w:t>
+              <w:br/>
+              <w:t>4. Start dev server:</w:t>
+              <w:br/>
+              <w:t xml:space="preserve">   ```bash</w:t>
+              <w:br/>
+              <w:t xml:space="preserve">   npm run dev</w:t>
+              <w:br/>
+              <w:t xml:space="preserve">   ```</w:t>
+              <w:br/>
+              <w:br/>
+              <w:t>### 2. Frontend Setup</w:t>
+              <w:br/>
+              <w:t>1. Navigate to client directory and start dev server:</w:t>
+              <w:br/>
+              <w:t xml:space="preserve">   ```bash</w:t>
+              <w:br/>
+              <w:t xml:space="preserve">   cd client &amp;&amp; npm install &amp;&amp; npm run dev</w:t>
+              <w:br/>
+              <w:t xml:space="preserve">   ```</w:t>
+              <w:br/>
+              <w:br/>
+              <w:t>### 3. Automated Tests</w:t>
+              <w:br/>
+              <w:t>- **Backend API Tests**: `cd server &amp;&amp; npm test`</w:t>
+              <w:br/>
+              <w:t>- **Frontend Component Tests**: `cd client &amp;&amp; npm test`</w:t>
+              <w:br/>
+              <w:t>- **Playwright E2E Tests**: `npx playwright test`</w:t>
+            </w:r>
+          </w:p>
+        </w:tc>
+      </w:tr>
+    </w:tbl>
+    <w:p>
+      <w:pPr>
+        <w:spacing w:before="120" w:after="120"/>
+        <w:pBdr>
+          <w:bottom w:val="single" w:sz="6" w:space="1" w:color="CBD5E1"/>
+        </w:pBdr>
+      </w:pPr>
+    </w:p>
+    <w:p>
+      <w:pPr>
+        <w:pStyle w:val="Heading2"/>
+        <w:spacing w:before="240" w:after="80"/>
+      </w:pPr>
+      <w:r>
+        <w:rPr>
+          <w:rFonts w:ascii="Arial" w:hAnsi="Arial"/>
+          <w:b/>
+          <w:color w:val="1E293B"/>
+          <w:sz w:val="26"/>
+        </w:rPr>
+        <w:t>7. Rendered `docs/lab-02/reviewer.md` (Peer Reviewer Log)</w:t>
       </w:r>
     </w:p>
     <w:tbl>
@@ -5177,7 +5692,1051 @@
           <w:color w:val="1E293B"/>
           <w:sz w:val="26"/>
         </w:rPr>
-        <w:t>2. Terminal Test Evidence on `main` Branch</w:t>
+        <w:t>2. Acceptance-Criterion Traceability Matrix</w:t>
+      </w:r>
+    </w:p>
+    <w:tbl>
+      <w:tblPr>
+        <w:tblW w:type="auto" w:w="0"/>
+        <w:jc w:val="center"/>
+        <w:tblLook w:firstColumn="1" w:firstRow="1" w:lastColumn="0" w:lastRow="0" w:noHBand="0" w:noVBand="1" w:val="04A0"/>
+      </w:tblPr>
+      <w:tblGrid>
+        <w:gridCol w:w="3120"/>
+        <w:gridCol w:w="3120"/>
+        <w:gridCol w:w="3120"/>
+      </w:tblGrid>
+      <w:tr>
+        <w:tc>
+          <w:tcPr>
+            <w:tcW w:type="dxa" w:w="3120"/>
+            <w:shd w:fill="006B3C"/>
+            <w:tcMar>
+              <w:top w:w="100" w:type="dxa"/>
+              <w:bottom w:w="100" w:type="dxa"/>
+              <w:left w:w="120" w:type="dxa"/>
+              <w:right w:w="120" w:type="dxa"/>
+            </w:tcMar>
+          </w:tcPr>
+          <w:p>
+            <w:pPr>
+              <w:spacing w:after="0"/>
+            </w:pPr>
+            <w:r>
+              <w:rPr>
+                <w:rFonts w:ascii="Arial" w:hAnsi="Arial"/>
+                <w:b/>
+                <w:color w:val="FFFFFF"/>
+                <w:sz w:val="19"/>
+              </w:rPr>
+              <w:t>Acceptance Criterion</w:t>
+            </w:r>
+          </w:p>
+        </w:tc>
+        <w:tc>
+          <w:tcPr>
+            <w:tcW w:type="dxa" w:w="3120"/>
+            <w:shd w:fill="006B3C"/>
+            <w:tcMar>
+              <w:top w:w="100" w:type="dxa"/>
+              <w:bottom w:w="100" w:type="dxa"/>
+              <w:left w:w="120" w:type="dxa"/>
+              <w:right w:w="120" w:type="dxa"/>
+            </w:tcMar>
+          </w:tcPr>
+          <w:p>
+            <w:pPr>
+              <w:spacing w:after="0"/>
+            </w:pPr>
+            <w:r>
+              <w:rPr>
+                <w:rFonts w:ascii="Arial" w:hAnsi="Arial"/>
+                <w:b/>
+                <w:color w:val="FFFFFF"/>
+                <w:sz w:val="19"/>
+              </w:rPr>
+              <w:t>Covered Automated Tests</w:t>
+            </w:r>
+          </w:p>
+        </w:tc>
+        <w:tc>
+          <w:tcPr>
+            <w:tcW w:type="dxa" w:w="3120"/>
+            <w:shd w:fill="006B3C"/>
+            <w:tcMar>
+              <w:top w:w="100" w:type="dxa"/>
+              <w:bottom w:w="100" w:type="dxa"/>
+              <w:left w:w="120" w:type="dxa"/>
+              <w:right w:w="120" w:type="dxa"/>
+            </w:tcMar>
+          </w:tcPr>
+          <w:p>
+            <w:pPr>
+              <w:spacing w:after="0"/>
+            </w:pPr>
+            <w:r>
+              <w:rPr>
+                <w:rFonts w:ascii="Arial" w:hAnsi="Arial"/>
+                <w:b/>
+                <w:color w:val="FFFFFF"/>
+                <w:sz w:val="19"/>
+              </w:rPr>
+              <w:t>Verification Status</w:t>
+            </w:r>
+          </w:p>
+        </w:tc>
+      </w:tr>
+      <w:tr>
+        <w:tc>
+          <w:tcPr>
+            <w:tcW w:type="dxa" w:w="3120"/>
+            <w:shd w:fill="FFFFFF"/>
+            <w:tcMar>
+              <w:top w:w="80" w:type="dxa"/>
+              <w:bottom w:w="80" w:type="dxa"/>
+              <w:left w:w="120" w:type="dxa"/>
+              <w:right w:w="120" w:type="dxa"/>
+            </w:tcMar>
+          </w:tcPr>
+          <w:p>
+            <w:pPr>
+              <w:spacing w:after="0"/>
+            </w:pPr>
+            <w:r>
+              <w:rPr>
+                <w:rFonts w:ascii="Arial" w:hAnsi="Arial"/>
+                <w:color w:val="334155"/>
+                <w:sz w:val="18"/>
+              </w:rPr>
+              <w:t>AC-01 (Valid Ticket Submission &amp; Ticket No)</w:t>
+            </w:r>
+          </w:p>
+        </w:tc>
+        <w:tc>
+          <w:tcPr>
+            <w:tcW w:type="dxa" w:w="3120"/>
+            <w:shd w:fill="FFFFFF"/>
+            <w:tcMar>
+              <w:top w:w="80" w:type="dxa"/>
+              <w:bottom w:w="80" w:type="dxa"/>
+              <w:left w:w="120" w:type="dxa"/>
+              <w:right w:w="120" w:type="dxa"/>
+            </w:tcMar>
+          </w:tcPr>
+          <w:p>
+            <w:pPr>
+              <w:spacing w:after="0"/>
+            </w:pPr>
+            <w:r>
+              <w:rPr>
+                <w:rFonts w:ascii="Arial" w:hAnsi="Arial"/>
+                <w:color w:val="334155"/>
+                <w:sz w:val="18"/>
+              </w:rPr>
+              <w:t>API-01, UI-03, E2E-01</w:t>
+            </w:r>
+          </w:p>
+        </w:tc>
+        <w:tc>
+          <w:tcPr>
+            <w:tcW w:type="dxa" w:w="3120"/>
+            <w:shd w:fill="FFFFFF"/>
+            <w:tcMar>
+              <w:top w:w="80" w:type="dxa"/>
+              <w:bottom w:w="80" w:type="dxa"/>
+              <w:left w:w="120" w:type="dxa"/>
+              <w:right w:w="120" w:type="dxa"/>
+            </w:tcMar>
+          </w:tcPr>
+          <w:p>
+            <w:pPr>
+              <w:spacing w:after="0"/>
+            </w:pPr>
+            <w:r>
+              <w:rPr>
+                <w:rFonts w:ascii="Arial" w:hAnsi="Arial"/>
+                <w:color w:val="334155"/>
+                <w:sz w:val="18"/>
+              </w:rPr>
+              <w:t>Covered</w:t>
+            </w:r>
+          </w:p>
+        </w:tc>
+      </w:tr>
+      <w:tr>
+        <w:tc>
+          <w:tcPr>
+            <w:tcW w:type="dxa" w:w="3120"/>
+            <w:shd w:fill="F8FAFC"/>
+            <w:tcMar>
+              <w:top w:w="80" w:type="dxa"/>
+              <w:bottom w:w="80" w:type="dxa"/>
+              <w:left w:w="120" w:type="dxa"/>
+              <w:right w:w="120" w:type="dxa"/>
+            </w:tcMar>
+          </w:tcPr>
+          <w:p>
+            <w:pPr>
+              <w:spacing w:after="0"/>
+            </w:pPr>
+            <w:r>
+              <w:rPr>
+                <w:rFonts w:ascii="Arial" w:hAnsi="Arial"/>
+                <w:color w:val="334155"/>
+                <w:sz w:val="18"/>
+              </w:rPr>
+              <w:t>AC-02 (Unselected Requester Redirect)</w:t>
+            </w:r>
+          </w:p>
+        </w:tc>
+        <w:tc>
+          <w:tcPr>
+            <w:tcW w:type="dxa" w:w="3120"/>
+            <w:shd w:fill="F8FAFC"/>
+            <w:tcMar>
+              <w:top w:w="80" w:type="dxa"/>
+              <w:bottom w:w="80" w:type="dxa"/>
+              <w:left w:w="120" w:type="dxa"/>
+              <w:right w:w="120" w:type="dxa"/>
+            </w:tcMar>
+          </w:tcPr>
+          <w:p>
+            <w:pPr>
+              <w:spacing w:after="0"/>
+            </w:pPr>
+            <w:r>
+              <w:rPr>
+                <w:rFonts w:ascii="Arial" w:hAnsi="Arial"/>
+                <w:color w:val="334155"/>
+                <w:sz w:val="18"/>
+              </w:rPr>
+              <w:t>UI-01, E2E-01</w:t>
+            </w:r>
+          </w:p>
+        </w:tc>
+        <w:tc>
+          <w:tcPr>
+            <w:tcW w:type="dxa" w:w="3120"/>
+            <w:shd w:fill="F8FAFC"/>
+            <w:tcMar>
+              <w:top w:w="80" w:type="dxa"/>
+              <w:bottom w:w="80" w:type="dxa"/>
+              <w:left w:w="120" w:type="dxa"/>
+              <w:right w:w="120" w:type="dxa"/>
+            </w:tcMar>
+          </w:tcPr>
+          <w:p>
+            <w:pPr>
+              <w:spacing w:after="0"/>
+            </w:pPr>
+            <w:r>
+              <w:rPr>
+                <w:rFonts w:ascii="Arial" w:hAnsi="Arial"/>
+                <w:color w:val="334155"/>
+                <w:sz w:val="18"/>
+              </w:rPr>
+              <w:t>Covered</w:t>
+            </w:r>
+          </w:p>
+        </w:tc>
+      </w:tr>
+      <w:tr>
+        <w:tc>
+          <w:tcPr>
+            <w:tcW w:type="dxa" w:w="3120"/>
+            <w:shd w:fill="FFFFFF"/>
+            <w:tcMar>
+              <w:top w:w="80" w:type="dxa"/>
+              <w:bottom w:w="80" w:type="dxa"/>
+              <w:left w:w="120" w:type="dxa"/>
+              <w:right w:w="120" w:type="dxa"/>
+            </w:tcMar>
+          </w:tcPr>
+          <w:p>
+            <w:pPr>
+              <w:spacing w:after="0"/>
+            </w:pPr>
+            <w:r>
+              <w:rPr>
+                <w:rFonts w:ascii="Arial" w:hAnsi="Arial"/>
+                <w:color w:val="334155"/>
+                <w:sz w:val="18"/>
+              </w:rPr>
+              <w:t>AC-03 (My Tickets Ownership Isolation)</w:t>
+            </w:r>
+          </w:p>
+        </w:tc>
+        <w:tc>
+          <w:tcPr>
+            <w:tcW w:type="dxa" w:w="3120"/>
+            <w:shd w:fill="FFFFFF"/>
+            <w:tcMar>
+              <w:top w:w="80" w:type="dxa"/>
+              <w:bottom w:w="80" w:type="dxa"/>
+              <w:left w:w="120" w:type="dxa"/>
+              <w:right w:w="120" w:type="dxa"/>
+            </w:tcMar>
+          </w:tcPr>
+          <w:p>
+            <w:pPr>
+              <w:spacing w:after="0"/>
+            </w:pPr>
+            <w:r>
+              <w:rPr>
+                <w:rFonts w:ascii="Arial" w:hAnsi="Arial"/>
+                <w:color w:val="334155"/>
+                <w:sz w:val="18"/>
+              </w:rPr>
+              <w:t>API-03, E2E-01</w:t>
+            </w:r>
+          </w:p>
+        </w:tc>
+        <w:tc>
+          <w:tcPr>
+            <w:tcW w:type="dxa" w:w="3120"/>
+            <w:shd w:fill="FFFFFF"/>
+            <w:tcMar>
+              <w:top w:w="80" w:type="dxa"/>
+              <w:bottom w:w="80" w:type="dxa"/>
+              <w:left w:w="120" w:type="dxa"/>
+              <w:right w:w="120" w:type="dxa"/>
+            </w:tcMar>
+          </w:tcPr>
+          <w:p>
+            <w:pPr>
+              <w:spacing w:after="0"/>
+            </w:pPr>
+            <w:r>
+              <w:rPr>
+                <w:rFonts w:ascii="Arial" w:hAnsi="Arial"/>
+                <w:color w:val="334155"/>
+                <w:sz w:val="18"/>
+              </w:rPr>
+              <w:t>Covered</w:t>
+            </w:r>
+          </w:p>
+        </w:tc>
+      </w:tr>
+      <w:tr>
+        <w:tc>
+          <w:tcPr>
+            <w:tcW w:type="dxa" w:w="3120"/>
+            <w:shd w:fill="F8FAFC"/>
+            <w:tcMar>
+              <w:top w:w="80" w:type="dxa"/>
+              <w:bottom w:w="80" w:type="dxa"/>
+              <w:left w:w="120" w:type="dxa"/>
+              <w:right w:w="120" w:type="dxa"/>
+            </w:tcMar>
+          </w:tcPr>
+          <w:p>
+            <w:pPr>
+              <w:spacing w:after="0"/>
+            </w:pPr>
+            <w:r>
+              <w:rPr>
+                <w:rFonts w:ascii="Arial" w:hAnsi="Arial"/>
+                <w:color w:val="334155"/>
+                <w:sz w:val="18"/>
+              </w:rPr>
+              <w:t>AC-04 (Cross-Requester Access Forbidden)</w:t>
+            </w:r>
+          </w:p>
+        </w:tc>
+        <w:tc>
+          <w:tcPr>
+            <w:tcW w:type="dxa" w:w="3120"/>
+            <w:shd w:fill="F8FAFC"/>
+            <w:tcMar>
+              <w:top w:w="80" w:type="dxa"/>
+              <w:bottom w:w="80" w:type="dxa"/>
+              <w:left w:w="120" w:type="dxa"/>
+              <w:right w:w="120" w:type="dxa"/>
+            </w:tcMar>
+          </w:tcPr>
+          <w:p>
+            <w:pPr>
+              <w:spacing w:after="0"/>
+            </w:pPr>
+            <w:r>
+              <w:rPr>
+                <w:rFonts w:ascii="Arial" w:hAnsi="Arial"/>
+                <w:color w:val="334155"/>
+                <w:sz w:val="18"/>
+              </w:rPr>
+              <w:t>API-04, E2E-02</w:t>
+            </w:r>
+          </w:p>
+        </w:tc>
+        <w:tc>
+          <w:tcPr>
+            <w:tcW w:type="dxa" w:w="3120"/>
+            <w:shd w:fill="F8FAFC"/>
+            <w:tcMar>
+              <w:top w:w="80" w:type="dxa"/>
+              <w:bottom w:w="80" w:type="dxa"/>
+              <w:left w:w="120" w:type="dxa"/>
+              <w:right w:w="120" w:type="dxa"/>
+            </w:tcMar>
+          </w:tcPr>
+          <w:p>
+            <w:pPr>
+              <w:spacing w:after="0"/>
+            </w:pPr>
+            <w:r>
+              <w:rPr>
+                <w:rFonts w:ascii="Arial" w:hAnsi="Arial"/>
+                <w:color w:val="334155"/>
+                <w:sz w:val="18"/>
+              </w:rPr>
+              <w:t>Covered</w:t>
+            </w:r>
+          </w:p>
+        </w:tc>
+      </w:tr>
+      <w:tr>
+        <w:tc>
+          <w:tcPr>
+            <w:tcW w:type="dxa" w:w="3120"/>
+            <w:shd w:fill="FFFFFF"/>
+            <w:tcMar>
+              <w:top w:w="80" w:type="dxa"/>
+              <w:bottom w:w="80" w:type="dxa"/>
+              <w:left w:w="120" w:type="dxa"/>
+              <w:right w:w="120" w:type="dxa"/>
+            </w:tcMar>
+          </w:tcPr>
+          <w:p>
+            <w:pPr>
+              <w:spacing w:after="0"/>
+            </w:pPr>
+            <w:r>
+              <w:rPr>
+                <w:rFonts w:ascii="Arial" w:hAnsi="Arial"/>
+                <w:color w:val="334155"/>
+                <w:sz w:val="18"/>
+              </w:rPr>
+              <w:t>AC-05 (Form Validation &amp; Red Asterisks)</w:t>
+            </w:r>
+          </w:p>
+        </w:tc>
+        <w:tc>
+          <w:tcPr>
+            <w:tcW w:type="dxa" w:w="3120"/>
+            <w:shd w:fill="FFFFFF"/>
+            <w:tcMar>
+              <w:top w:w="80" w:type="dxa"/>
+              <w:bottom w:w="80" w:type="dxa"/>
+              <w:left w:w="120" w:type="dxa"/>
+              <w:right w:w="120" w:type="dxa"/>
+            </w:tcMar>
+          </w:tcPr>
+          <w:p>
+            <w:pPr>
+              <w:spacing w:after="0"/>
+            </w:pPr>
+            <w:r>
+              <w:rPr>
+                <w:rFonts w:ascii="Arial" w:hAnsi="Arial"/>
+                <w:color w:val="334155"/>
+                <w:sz w:val="18"/>
+              </w:rPr>
+              <w:t>API-02, UI-02</w:t>
+            </w:r>
+          </w:p>
+        </w:tc>
+        <w:tc>
+          <w:tcPr>
+            <w:tcW w:type="dxa" w:w="3120"/>
+            <w:shd w:fill="FFFFFF"/>
+            <w:tcMar>
+              <w:top w:w="80" w:type="dxa"/>
+              <w:bottom w:w="80" w:type="dxa"/>
+              <w:left w:w="120" w:type="dxa"/>
+              <w:right w:w="120" w:type="dxa"/>
+            </w:tcMar>
+          </w:tcPr>
+          <w:p>
+            <w:pPr>
+              <w:spacing w:after="0"/>
+            </w:pPr>
+            <w:r>
+              <w:rPr>
+                <w:rFonts w:ascii="Arial" w:hAnsi="Arial"/>
+                <w:color w:val="334155"/>
+                <w:sz w:val="18"/>
+              </w:rPr>
+              <w:t>Covered</w:t>
+            </w:r>
+          </w:p>
+        </w:tc>
+      </w:tr>
+      <w:tr>
+        <w:tc>
+          <w:tcPr>
+            <w:tcW w:type="dxa" w:w="3120"/>
+            <w:shd w:fill="F8FAFC"/>
+            <w:tcMar>
+              <w:top w:w="80" w:type="dxa"/>
+              <w:bottom w:w="80" w:type="dxa"/>
+              <w:left w:w="120" w:type="dxa"/>
+              <w:right w:w="120" w:type="dxa"/>
+            </w:tcMar>
+          </w:tcPr>
+          <w:p>
+            <w:pPr>
+              <w:spacing w:after="0"/>
+            </w:pPr>
+            <w:r>
+              <w:rPr>
+                <w:rFonts w:ascii="Arial" w:hAnsi="Arial"/>
+                <w:color w:val="334155"/>
+                <w:sz w:val="18"/>
+              </w:rPr>
+              <w:t>AC-06 (Attachment Type &amp; Size Limit Validation)</w:t>
+            </w:r>
+          </w:p>
+        </w:tc>
+        <w:tc>
+          <w:tcPr>
+            <w:tcW w:type="dxa" w:w="3120"/>
+            <w:shd w:fill="F8FAFC"/>
+            <w:tcMar>
+              <w:top w:w="80" w:type="dxa"/>
+              <w:bottom w:w="80" w:type="dxa"/>
+              <w:left w:w="120" w:type="dxa"/>
+              <w:right w:w="120" w:type="dxa"/>
+            </w:tcMar>
+          </w:tcPr>
+          <w:p>
+            <w:pPr>
+              <w:spacing w:after="0"/>
+            </w:pPr>
+            <w:r>
+              <w:rPr>
+                <w:rFonts w:ascii="Arial" w:hAnsi="Arial"/>
+                <w:color w:val="334155"/>
+                <w:sz w:val="18"/>
+              </w:rPr>
+              <w:t>API-05</w:t>
+            </w:r>
+          </w:p>
+        </w:tc>
+        <w:tc>
+          <w:tcPr>
+            <w:tcW w:type="dxa" w:w="3120"/>
+            <w:shd w:fill="F8FAFC"/>
+            <w:tcMar>
+              <w:top w:w="80" w:type="dxa"/>
+              <w:bottom w:w="80" w:type="dxa"/>
+              <w:left w:w="120" w:type="dxa"/>
+              <w:right w:w="120" w:type="dxa"/>
+            </w:tcMar>
+          </w:tcPr>
+          <w:p>
+            <w:pPr>
+              <w:spacing w:after="0"/>
+            </w:pPr>
+            <w:r>
+              <w:rPr>
+                <w:rFonts w:ascii="Arial" w:hAnsi="Arial"/>
+                <w:color w:val="334155"/>
+                <w:sz w:val="18"/>
+              </w:rPr>
+              <w:t>Covered</w:t>
+            </w:r>
+          </w:p>
+        </w:tc>
+      </w:tr>
+      <w:tr>
+        <w:tc>
+          <w:tcPr>
+            <w:tcW w:type="dxa" w:w="3120"/>
+            <w:shd w:fill="FFFFFF"/>
+            <w:tcMar>
+              <w:top w:w="80" w:type="dxa"/>
+              <w:bottom w:w="80" w:type="dxa"/>
+              <w:left w:w="120" w:type="dxa"/>
+              <w:right w:w="120" w:type="dxa"/>
+            </w:tcMar>
+          </w:tcPr>
+          <w:p>
+            <w:pPr>
+              <w:spacing w:after="0"/>
+            </w:pPr>
+            <w:r>
+              <w:rPr>
+                <w:rFonts w:ascii="Arial" w:hAnsi="Arial"/>
+                <w:color w:val="334155"/>
+                <w:sz w:val="18"/>
+              </w:rPr>
+              <w:t>AC-07 (Max 5 Active Attachments Limit)</w:t>
+            </w:r>
+          </w:p>
+        </w:tc>
+        <w:tc>
+          <w:tcPr>
+            <w:tcW w:type="dxa" w:w="3120"/>
+            <w:shd w:fill="FFFFFF"/>
+            <w:tcMar>
+              <w:top w:w="80" w:type="dxa"/>
+              <w:bottom w:w="80" w:type="dxa"/>
+              <w:left w:w="120" w:type="dxa"/>
+              <w:right w:w="120" w:type="dxa"/>
+            </w:tcMar>
+          </w:tcPr>
+          <w:p>
+            <w:pPr>
+              <w:spacing w:after="0"/>
+            </w:pPr>
+            <w:r>
+              <w:rPr>
+                <w:rFonts w:ascii="Arial" w:hAnsi="Arial"/>
+                <w:color w:val="334155"/>
+                <w:sz w:val="18"/>
+              </w:rPr>
+              <w:t>API-06</w:t>
+            </w:r>
+          </w:p>
+        </w:tc>
+        <w:tc>
+          <w:tcPr>
+            <w:tcW w:type="dxa" w:w="3120"/>
+            <w:shd w:fill="FFFFFF"/>
+            <w:tcMar>
+              <w:top w:w="80" w:type="dxa"/>
+              <w:bottom w:w="80" w:type="dxa"/>
+              <w:left w:w="120" w:type="dxa"/>
+              <w:right w:w="120" w:type="dxa"/>
+            </w:tcMar>
+          </w:tcPr>
+          <w:p>
+            <w:pPr>
+              <w:spacing w:after="0"/>
+            </w:pPr>
+            <w:r>
+              <w:rPr>
+                <w:rFonts w:ascii="Arial" w:hAnsi="Arial"/>
+                <w:color w:val="334155"/>
+                <w:sz w:val="18"/>
+              </w:rPr>
+              <w:t>Covered</w:t>
+            </w:r>
+          </w:p>
+        </w:tc>
+      </w:tr>
+      <w:tr>
+        <w:tc>
+          <w:tcPr>
+            <w:tcW w:type="dxa" w:w="3120"/>
+            <w:shd w:fill="F8FAFC"/>
+            <w:tcMar>
+              <w:top w:w="80" w:type="dxa"/>
+              <w:bottom w:w="80" w:type="dxa"/>
+              <w:left w:w="120" w:type="dxa"/>
+              <w:right w:w="120" w:type="dxa"/>
+            </w:tcMar>
+          </w:tcPr>
+          <w:p>
+            <w:pPr>
+              <w:spacing w:after="0"/>
+            </w:pPr>
+            <w:r>
+              <w:rPr>
+                <w:rFonts w:ascii="Arial" w:hAnsi="Arial"/>
+                <w:color w:val="334155"/>
+                <w:sz w:val="18"/>
+              </w:rPr>
+              <w:t>AC-08 (Attachment Soft Removal &amp; Reason)</w:t>
+            </w:r>
+          </w:p>
+        </w:tc>
+        <w:tc>
+          <w:tcPr>
+            <w:tcW w:type="dxa" w:w="3120"/>
+            <w:shd w:fill="F8FAFC"/>
+            <w:tcMar>
+              <w:top w:w="80" w:type="dxa"/>
+              <w:bottom w:w="80" w:type="dxa"/>
+              <w:left w:w="120" w:type="dxa"/>
+              <w:right w:w="120" w:type="dxa"/>
+            </w:tcMar>
+          </w:tcPr>
+          <w:p>
+            <w:pPr>
+              <w:spacing w:after="0"/>
+            </w:pPr>
+            <w:r>
+              <w:rPr>
+                <w:rFonts w:ascii="Arial" w:hAnsi="Arial"/>
+                <w:color w:val="334155"/>
+                <w:sz w:val="18"/>
+              </w:rPr>
+              <w:t>API-07, API-08, UI-06, E2E-02</w:t>
+            </w:r>
+          </w:p>
+        </w:tc>
+        <w:tc>
+          <w:tcPr>
+            <w:tcW w:type="dxa" w:w="3120"/>
+            <w:shd w:fill="F8FAFC"/>
+            <w:tcMar>
+              <w:top w:w="80" w:type="dxa"/>
+              <w:bottom w:w="80" w:type="dxa"/>
+              <w:left w:w="120" w:type="dxa"/>
+              <w:right w:w="120" w:type="dxa"/>
+            </w:tcMar>
+          </w:tcPr>
+          <w:p>
+            <w:pPr>
+              <w:spacing w:after="0"/>
+            </w:pPr>
+            <w:r>
+              <w:rPr>
+                <w:rFonts w:ascii="Arial" w:hAnsi="Arial"/>
+                <w:color w:val="334155"/>
+                <w:sz w:val="18"/>
+              </w:rPr>
+              <w:t>Covered</w:t>
+            </w:r>
+          </w:p>
+        </w:tc>
+      </w:tr>
+      <w:tr>
+        <w:tc>
+          <w:tcPr>
+            <w:tcW w:type="dxa" w:w="3120"/>
+            <w:shd w:fill="FFFFFF"/>
+            <w:tcMar>
+              <w:top w:w="80" w:type="dxa"/>
+              <w:bottom w:w="80" w:type="dxa"/>
+              <w:left w:w="120" w:type="dxa"/>
+              <w:right w:w="120" w:type="dxa"/>
+            </w:tcMar>
+          </w:tcPr>
+          <w:p>
+            <w:pPr>
+              <w:spacing w:after="0"/>
+            </w:pPr>
+            <w:r>
+              <w:rPr>
+                <w:rFonts w:ascii="Arial" w:hAnsi="Arial"/>
+                <w:color w:val="334155"/>
+                <w:sz w:val="18"/>
+              </w:rPr>
+              <w:t>AC-09 (Pagination Controls &amp; Meta)</w:t>
+            </w:r>
+          </w:p>
+        </w:tc>
+        <w:tc>
+          <w:tcPr>
+            <w:tcW w:type="dxa" w:w="3120"/>
+            <w:shd w:fill="FFFFFF"/>
+            <w:tcMar>
+              <w:top w:w="80" w:type="dxa"/>
+              <w:bottom w:w="80" w:type="dxa"/>
+              <w:left w:w="120" w:type="dxa"/>
+              <w:right w:w="120" w:type="dxa"/>
+            </w:tcMar>
+          </w:tcPr>
+          <w:p>
+            <w:pPr>
+              <w:spacing w:after="0"/>
+            </w:pPr>
+            <w:r>
+              <w:rPr>
+                <w:rFonts w:ascii="Arial" w:hAnsi="Arial"/>
+                <w:color w:val="334155"/>
+                <w:sz w:val="18"/>
+              </w:rPr>
+              <w:t>UI-05</w:t>
+            </w:r>
+          </w:p>
+        </w:tc>
+        <w:tc>
+          <w:tcPr>
+            <w:tcW w:type="dxa" w:w="3120"/>
+            <w:shd w:fill="FFFFFF"/>
+            <w:tcMar>
+              <w:top w:w="80" w:type="dxa"/>
+              <w:bottom w:w="80" w:type="dxa"/>
+              <w:left w:w="120" w:type="dxa"/>
+              <w:right w:w="120" w:type="dxa"/>
+            </w:tcMar>
+          </w:tcPr>
+          <w:p>
+            <w:pPr>
+              <w:spacing w:after="0"/>
+            </w:pPr>
+            <w:r>
+              <w:rPr>
+                <w:rFonts w:ascii="Arial" w:hAnsi="Arial"/>
+                <w:color w:val="334155"/>
+                <w:sz w:val="18"/>
+              </w:rPr>
+              <w:t>Covered</w:t>
+            </w:r>
+          </w:p>
+        </w:tc>
+      </w:tr>
+      <w:tr>
+        <w:tc>
+          <w:tcPr>
+            <w:tcW w:type="dxa" w:w="3120"/>
+            <w:shd w:fill="F8FAFC"/>
+            <w:tcMar>
+              <w:top w:w="80" w:type="dxa"/>
+              <w:bottom w:w="80" w:type="dxa"/>
+              <w:left w:w="120" w:type="dxa"/>
+              <w:right w:w="120" w:type="dxa"/>
+            </w:tcMar>
+          </w:tcPr>
+          <w:p>
+            <w:pPr>
+              <w:spacing w:after="0"/>
+            </w:pPr>
+            <w:r>
+              <w:rPr>
+                <w:rFonts w:ascii="Arial" w:hAnsi="Arial"/>
+                <w:color w:val="334155"/>
+                <w:sz w:val="18"/>
+              </w:rPr>
+              <w:t>AC-10 (Keyword Search &amp; Filters)</w:t>
+            </w:r>
+          </w:p>
+        </w:tc>
+        <w:tc>
+          <w:tcPr>
+            <w:tcW w:type="dxa" w:w="3120"/>
+            <w:shd w:fill="F8FAFC"/>
+            <w:tcMar>
+              <w:top w:w="80" w:type="dxa"/>
+              <w:bottom w:w="80" w:type="dxa"/>
+              <w:left w:w="120" w:type="dxa"/>
+              <w:right w:w="120" w:type="dxa"/>
+            </w:tcMar>
+          </w:tcPr>
+          <w:p>
+            <w:pPr>
+              <w:spacing w:after="0"/>
+            </w:pPr>
+            <w:r>
+              <w:rPr>
+                <w:rFonts w:ascii="Arial" w:hAnsi="Arial"/>
+                <w:color w:val="334155"/>
+                <w:sz w:val="18"/>
+              </w:rPr>
+              <w:t>UI-04</w:t>
+            </w:r>
+          </w:p>
+        </w:tc>
+        <w:tc>
+          <w:tcPr>
+            <w:tcW w:type="dxa" w:w="3120"/>
+            <w:shd w:fill="F8FAFC"/>
+            <w:tcMar>
+              <w:top w:w="80" w:type="dxa"/>
+              <w:bottom w:w="80" w:type="dxa"/>
+              <w:left w:w="120" w:type="dxa"/>
+              <w:right w:w="120" w:type="dxa"/>
+            </w:tcMar>
+          </w:tcPr>
+          <w:p>
+            <w:pPr>
+              <w:spacing w:after="0"/>
+            </w:pPr>
+            <w:r>
+              <w:rPr>
+                <w:rFonts w:ascii="Arial" w:hAnsi="Arial"/>
+                <w:color w:val="334155"/>
+                <w:sz w:val="18"/>
+              </w:rPr>
+              <w:t>Covered</w:t>
+            </w:r>
+          </w:p>
+        </w:tc>
+      </w:tr>
+      <w:tr>
+        <w:tc>
+          <w:tcPr>
+            <w:tcW w:type="dxa" w:w="3120"/>
+            <w:shd w:fill="FFFFFF"/>
+            <w:tcMar>
+              <w:top w:w="80" w:type="dxa"/>
+              <w:bottom w:w="80" w:type="dxa"/>
+              <w:left w:w="120" w:type="dxa"/>
+              <w:right w:w="120" w:type="dxa"/>
+            </w:tcMar>
+          </w:tcPr>
+          <w:p>
+            <w:pPr>
+              <w:spacing w:after="0"/>
+            </w:pPr>
+            <w:r>
+              <w:rPr>
+                <w:rFonts w:ascii="Arial" w:hAnsi="Arial"/>
+                <w:color w:val="334155"/>
+                <w:sz w:val="18"/>
+              </w:rPr>
+              <w:t>AC-11 (Server Failure &amp; Data Preservation)</w:t>
+            </w:r>
+          </w:p>
+        </w:tc>
+        <w:tc>
+          <w:tcPr>
+            <w:tcW w:type="dxa" w:w="3120"/>
+            <w:shd w:fill="FFFFFF"/>
+            <w:tcMar>
+              <w:top w:w="80" w:type="dxa"/>
+              <w:bottom w:w="80" w:type="dxa"/>
+              <w:left w:w="120" w:type="dxa"/>
+              <w:right w:w="120" w:type="dxa"/>
+            </w:tcMar>
+          </w:tcPr>
+          <w:p>
+            <w:pPr>
+              <w:spacing w:after="0"/>
+            </w:pPr>
+            <w:r>
+              <w:rPr>
+                <w:rFonts w:ascii="Arial" w:hAnsi="Arial"/>
+                <w:color w:val="334155"/>
+                <w:sz w:val="18"/>
+              </w:rPr>
+              <w:t>UI-02</w:t>
+            </w:r>
+          </w:p>
+        </w:tc>
+        <w:tc>
+          <w:tcPr>
+            <w:tcW w:type="dxa" w:w="3120"/>
+            <w:shd w:fill="FFFFFF"/>
+            <w:tcMar>
+              <w:top w:w="80" w:type="dxa"/>
+              <w:bottom w:w="80" w:type="dxa"/>
+              <w:left w:w="120" w:type="dxa"/>
+              <w:right w:w="120" w:type="dxa"/>
+            </w:tcMar>
+          </w:tcPr>
+          <w:p>
+            <w:pPr>
+              <w:spacing w:after="0"/>
+            </w:pPr>
+            <w:r>
+              <w:rPr>
+                <w:rFonts w:ascii="Arial" w:hAnsi="Arial"/>
+                <w:color w:val="334155"/>
+                <w:sz w:val="18"/>
+              </w:rPr>
+              <w:t>Covered</w:t>
+            </w:r>
+          </w:p>
+        </w:tc>
+      </w:tr>
+      <w:tr>
+        <w:tc>
+          <w:tcPr>
+            <w:tcW w:type="dxa" w:w="3120"/>
+            <w:shd w:fill="F8FAFC"/>
+            <w:tcMar>
+              <w:top w:w="80" w:type="dxa"/>
+              <w:bottom w:w="80" w:type="dxa"/>
+              <w:left w:w="120" w:type="dxa"/>
+              <w:right w:w="120" w:type="dxa"/>
+            </w:tcMar>
+          </w:tcPr>
+          <w:p>
+            <w:pPr>
+              <w:spacing w:after="0"/>
+            </w:pPr>
+            <w:r>
+              <w:rPr>
+                <w:rFonts w:ascii="Arial" w:hAnsi="Arial"/>
+                <w:color w:val="334155"/>
+                <w:sz w:val="18"/>
+              </w:rPr>
+              <w:t>AC-12 (Responsive Viewports &amp; Stacking)</w:t>
+            </w:r>
+          </w:p>
+        </w:tc>
+        <w:tc>
+          <w:tcPr>
+            <w:tcW w:type="dxa" w:w="3120"/>
+            <w:shd w:fill="F8FAFC"/>
+            <w:tcMar>
+              <w:top w:w="80" w:type="dxa"/>
+              <w:bottom w:w="80" w:type="dxa"/>
+              <w:left w:w="120" w:type="dxa"/>
+              <w:right w:w="120" w:type="dxa"/>
+            </w:tcMar>
+          </w:tcPr>
+          <w:p>
+            <w:pPr>
+              <w:spacing w:after="0"/>
+            </w:pPr>
+            <w:r>
+              <w:rPr>
+                <w:rFonts w:ascii="Arial" w:hAnsi="Arial"/>
+                <w:color w:val="334155"/>
+                <w:sz w:val="18"/>
+              </w:rPr>
+              <w:t>E2E-01, E2E-02</w:t>
+            </w:r>
+          </w:p>
+        </w:tc>
+        <w:tc>
+          <w:tcPr>
+            <w:tcW w:type="dxa" w:w="3120"/>
+            <w:shd w:fill="F8FAFC"/>
+            <w:tcMar>
+              <w:top w:w="80" w:type="dxa"/>
+              <w:bottom w:w="80" w:type="dxa"/>
+              <w:left w:w="120" w:type="dxa"/>
+              <w:right w:w="120" w:type="dxa"/>
+            </w:tcMar>
+          </w:tcPr>
+          <w:p>
+            <w:pPr>
+              <w:spacing w:after="0"/>
+            </w:pPr>
+            <w:r>
+              <w:rPr>
+                <w:rFonts w:ascii="Arial" w:hAnsi="Arial"/>
+                <w:color w:val="334155"/>
+                <w:sz w:val="18"/>
+              </w:rPr>
+              <w:t>Covered</w:t>
+            </w:r>
+          </w:p>
+        </w:tc>
+      </w:tr>
+    </w:tbl>
+    <w:p>
+      <w:pPr>
+        <w:spacing w:after="160"/>
+      </w:pPr>
+    </w:p>
+    <w:p>
+      <w:pPr>
+        <w:spacing w:before="120" w:after="120"/>
+        <w:pBdr>
+          <w:bottom w:val="single" w:sz="6" w:space="1" w:color="CBD5E1"/>
+        </w:pBdr>
+      </w:pPr>
+    </w:p>
+    <w:p>
+      <w:pPr>
+        <w:pStyle w:val="Heading2"/>
+        <w:spacing w:before="240" w:after="80"/>
+      </w:pPr>
+      <w:r>
+        <w:rPr>
+          <w:rFonts w:ascii="Arial" w:hAnsi="Arial"/>
+          <w:b/>
+          <w:color w:val="1E293B"/>
+          <w:sz w:val="26"/>
+        </w:rPr>
+        <w:t>3. Terminal Test Evidence on `main` Branch</w:t>
       </w:r>
     </w:p>
     <w:p>
@@ -5241,7 +6800,7 @@
               <w:br/>
               <w:t xml:space="preserve"> ✓ tests/lab-01/categories.test.ts (1 test) 91ms</w:t>
               <w:br/>
-              <w:t xml:space="preserve"> ✓ tests/lab-02/my-tickets.api.test.ts (2 tests) 162ms</w:t>
+              <w:t xml:space="preserve"> ✓ tests/lab-02/my-tickets.api.test.ts (2 tests) 140ms</w:t>
               <w:br/>
               <w:t xml:space="preserve"> ✓ tests/lab-02/ticket-detail.api.test.ts (2 tests) 213ms</w:t>
               <w:br/>
@@ -5323,6 +6882,49 @@
               <w:br/>
               <w:br/>
               <w:t xml:space="preserve">  2 passed (7.2s)</w:t>
+            </w:r>
+          </w:p>
+        </w:tc>
+      </w:tr>
+    </w:tbl>
+    <w:tbl>
+      <w:tblPr>
+        <w:tblW w:type="auto" w:w="0"/>
+        <w:jc w:val="center"/>
+        <w:tblLook w:firstColumn="1" w:firstRow="1" w:lastColumn="0" w:lastRow="0" w:noHBand="0" w:noVBand="1" w:val="04A0"/>
+      </w:tblPr>
+      <w:tblGrid>
+        <w:gridCol w:w="9360"/>
+      </w:tblGrid>
+      <w:tr>
+        <w:tc>
+          <w:tcPr>
+            <w:tcW w:type="dxa" w:w="9360"/>
+            <w:shd w:fill="F1F5F9"/>
+            <w:tcMar>
+              <w:top w:w="120" w:type="dxa"/>
+              <w:bottom w:w="120" w:type="dxa"/>
+              <w:left w:w="200" w:type="dxa"/>
+              <w:right w:w="200" w:type="dxa"/>
+            </w:tcMar>
+            <w:tcBorders>
+              <w:left w:val="single" w:sz="24" w:space="0" w:color="006B3C"/>
+              <w:top w:val="none"/>
+              <w:right w:val="none"/>
+              <w:bottom w:val="none"/>
+            </w:tcBorders>
+          </w:tcPr>
+          <w:p>
+            <w:pPr>
+              <w:spacing w:before="40" w:after="40" w:line="276" w:lineRule="auto"/>
+            </w:pPr>
+            <w:r>
+              <w:rPr>
+                <w:rFonts w:ascii="Consolas" w:hAnsi="Consolas"/>
+                <w:color w:val="1E293B"/>
+                <w:sz w:val="19"/>
+              </w:rPr>
+              <w:t>**[🖼️ จุดใส่รูปภาพที่ 4: แคปหน้าจอ Terminal ตอนรัน npx vitest run และ npx playwright test ผ่านครบ 100%]**</w:t>
             </w:r>
           </w:p>
         </w:tc>
@@ -6471,7 +8073,7 @@
                 <w:color w:val="1E293B"/>
                 <w:sz w:val="19"/>
               </w:rPr>
-              <w:t>**[🖼️ แนบภาพ Screenshot: หน้าจอ Requester Selector]**</w:t>
+              <w:t>**[🖼️ จุดใส่รูปภาพที่ 5: แคปหน้าจอเว็บ Requester Selector Screen]**</w:t>
             </w:r>
           </w:p>
         </w:tc>
@@ -6549,7 +8151,7 @@
                 <w:color w:val="1E293B"/>
                 <w:sz w:val="19"/>
               </w:rPr>
-              <w:t>**[🖼️ แนบภาพ Screenshot: หน้าจอ Create Ticket Form]**</w:t>
+              <w:t>**[🖼️ จุดใส่รูปภาพที่ 6: แคปหน้าจอเว็บ Create Ticket Form UI]**</w:t>
             </w:r>
           </w:p>
         </w:tc>
@@ -6627,7 +8229,7 @@
                 <w:color w:val="1E293B"/>
                 <w:sz w:val="19"/>
               </w:rPr>
-              <w:t>**[🖼️ แนบภาพ Screenshot: หน้าจอ My Tickets Dashboard]**</w:t>
+              <w:t>**[🖼️ จุดใส่รูปภาพที่ 7: แคปหน้าจอเว็บ My Tickets Dashboard]**</w:t>
             </w:r>
           </w:p>
         </w:tc>
@@ -6705,7 +8307,7 @@
                 <w:color w:val="1E293B"/>
                 <w:sz w:val="19"/>
               </w:rPr>
-              <w:t>**[🖼️ แนบภาพ Screenshot: หน้าจอ Ticket Detail และ Modal ลบไฟล์แนบ]**</w:t>
+              <w:t>**[🖼️ จุดใส่รูปภาพที่ 8: แคปหน้าจอเว็บ Ticket Detail View และ Modal ลบไฟล์แนบ]**</w:t>
             </w:r>
           </w:p>
         </w:tc>

</xml_diff>

<commit_message>
docs(report): embed all captured screenshots into report docs and docx
</commit_message>
<xml_diff>
--- a/docs/lab-02/LAB2_SUBMISSION_REPORT.docx
+++ b/docs/lab-02/LAB2_SUBMISSION_REPORT.docx
@@ -1002,49 +1002,46 @@
         <w:t>, and all Acceptance Criteria are satisfied.</w:t>
       </w:r>
     </w:p>
-    <w:tbl>
-      <w:tblPr>
-        <w:tblW w:type="auto" w:w="0"/>
+    <w:p>
+      <w:pPr>
+        <w:spacing w:before="120" w:after="120"/>
         <w:jc w:val="center"/>
-        <w:tblLook w:firstColumn="1" w:firstRow="1" w:lastColumn="0" w:lastRow="0" w:noHBand="0" w:noVBand="1" w:val="04A0"/>
-      </w:tblPr>
-      <w:tblGrid>
-        <w:gridCol w:w="9360"/>
-      </w:tblGrid>
-      <w:tr>
-        <w:tc>
-          <w:tcPr>
-            <w:tcW w:type="dxa" w:w="9360"/>
-            <w:shd w:fill="F1F5F9"/>
-            <w:tcMar>
-              <w:top w:w="120" w:type="dxa"/>
-              <w:bottom w:w="120" w:type="dxa"/>
-              <w:left w:w="200" w:type="dxa"/>
-              <w:right w:w="200" w:type="dxa"/>
-            </w:tcMar>
-            <w:tcBorders>
-              <w:left w:val="single" w:sz="24" w:space="0" w:color="006B3C"/>
-              <w:top w:val="none"/>
-              <w:right w:val="none"/>
-              <w:bottom w:val="none"/>
-            </w:tcBorders>
-          </w:tcPr>
-          <w:p>
-            <w:pPr>
-              <w:spacing w:before="40" w:after="40" w:line="276" w:lineRule="auto"/>
-            </w:pPr>
-            <w:r>
-              <w:rPr>
-                <w:rFonts w:ascii="Consolas" w:hAnsi="Consolas"/>
-                <w:color w:val="1E293B"/>
-                <w:sz w:val="19"/>
-              </w:rPr>
-              <w:t>**[🖼️ จุดใส่รูปภาพที่ 1: แคปหน้าจอ GitHub Project Kanban Board ของคุณที่มีการ์ดอยู่ในคอลัมน์ต่างๆ / Done]**</w:t>
-            </w:r>
-          </w:p>
-        </w:tc>
-      </w:tr>
-    </w:tbl>
+      </w:pPr>
+      <w:r>
+        <w:drawing>
+          <wp:inline xmlns:a="http://schemas.openxmlformats.org/drawingml/2006/main" xmlns:pic="http://schemas.openxmlformats.org/drawingml/2006/picture">
+            <wp:extent cx="5486400" cy="3429000"/>
+            <wp:docPr id="1" name="Picture 1"/>
+            <wp:cNvGraphicFramePr>
+              <a:graphicFrameLocks noChangeAspect="1"/>
+            </wp:cNvGraphicFramePr>
+            <a:graphic>
+              <a:graphicData uri="http://schemas.openxmlformats.org/drawingml/2006/picture">
+                <pic:pic>
+                  <pic:nvPicPr>
+                    <pic:cNvPr id="0" name="01_kanban_board.png"/>
+                    <pic:cNvPicPr/>
+                  </pic:nvPicPr>
+                  <pic:blipFill>
+                    <a:blip r:embed="rId9"/>
+                    <a:stretch>
+                      <a:fillRect/>
+                    </a:stretch>
+                  </pic:blipFill>
+                  <pic:spPr>
+                    <a:xfrm>
+                      <a:off x="0" y="0"/>
+                      <a:ext cx="5486400" cy="3429000"/>
+                    </a:xfrm>
+                    <a:prstGeom prst="rect"/>
+                  </pic:spPr>
+                </pic:pic>
+              </a:graphicData>
+            </a:graphic>
+          </wp:inline>
+        </w:drawing>
+      </w:r>
+    </w:p>
     <w:p>
       <w:pPr>
         <w:spacing w:before="120" w:after="120"/>
@@ -1155,49 +1152,46 @@
         </w:tc>
       </w:tr>
     </w:tbl>
-    <w:tbl>
-      <w:tblPr>
-        <w:tblW w:type="auto" w:w="0"/>
+    <w:p>
+      <w:pPr>
+        <w:spacing w:before="120" w:after="120"/>
         <w:jc w:val="center"/>
-        <w:tblLook w:firstColumn="1" w:firstRow="1" w:lastColumn="0" w:lastRow="0" w:noHBand="0" w:noVBand="1" w:val="04A0"/>
-      </w:tblPr>
-      <w:tblGrid>
-        <w:gridCol w:w="9360"/>
-      </w:tblGrid>
-      <w:tr>
-        <w:tc>
-          <w:tcPr>
-            <w:tcW w:type="dxa" w:w="9360"/>
-            <w:shd w:fill="F1F5F9"/>
-            <w:tcMar>
-              <w:top w:w="120" w:type="dxa"/>
-              <w:bottom w:w="120" w:type="dxa"/>
-              <w:left w:w="200" w:type="dxa"/>
-              <w:right w:w="200" w:type="dxa"/>
-            </w:tcMar>
-            <w:tcBorders>
-              <w:left w:val="single" w:sz="24" w:space="0" w:color="006B3C"/>
-              <w:top w:val="none"/>
-              <w:right w:val="none"/>
-              <w:bottom w:val="none"/>
-            </w:tcBorders>
-          </w:tcPr>
-          <w:p>
-            <w:pPr>
-              <w:spacing w:before="40" w:after="40" w:line="276" w:lineRule="auto"/>
-            </w:pPr>
-            <w:r>
-              <w:rPr>
-                <w:rFonts w:ascii="Consolas" w:hAnsi="Consolas"/>
-                <w:color w:val="1E293B"/>
-                <w:sz w:val="19"/>
-              </w:rPr>
-              <w:t>**[🖼️ จุดใส่รูปภาพที่ 2: แคปหน้าจอ Terminal ตอนรันคำสั่ง git log --oneline --graph -n 25 บนสาขา main]**</w:t>
-            </w:r>
-          </w:p>
-        </w:tc>
-      </w:tr>
-    </w:tbl>
+      </w:pPr>
+      <w:r>
+        <w:drawing>
+          <wp:inline xmlns:a="http://schemas.openxmlformats.org/drawingml/2006/main" xmlns:pic="http://schemas.openxmlformats.org/drawingml/2006/picture">
+            <wp:extent cx="5486400" cy="3429000"/>
+            <wp:docPr id="2" name="Picture 2"/>
+            <wp:cNvGraphicFramePr>
+              <a:graphicFrameLocks noChangeAspect="1"/>
+            </wp:cNvGraphicFramePr>
+            <a:graphic>
+              <a:graphicData uri="http://schemas.openxmlformats.org/drawingml/2006/picture">
+                <pic:pic>
+                  <pic:nvPicPr>
+                    <pic:cNvPr id="0" name="02_git_log_graph.png"/>
+                    <pic:cNvPicPr/>
+                  </pic:nvPicPr>
+                  <pic:blipFill>
+                    <a:blip r:embed="rId10"/>
+                    <a:stretch>
+                      <a:fillRect/>
+                    </a:stretch>
+                  </pic:blipFill>
+                  <pic:spPr>
+                    <a:xfrm>
+                      <a:off x="0" y="0"/>
+                      <a:ext cx="5486400" cy="3429000"/>
+                    </a:xfrm>
+                    <a:prstGeom prst="rect"/>
+                  </pic:spPr>
+                </pic:pic>
+              </a:graphicData>
+            </a:graphic>
+          </wp:inline>
+        </w:drawing>
+      </w:r>
+    </w:p>
     <w:p>
       <w:pPr>
         <w:spacing w:before="120" w:after="120"/>
@@ -2172,49 +2166,46 @@
         <w:t>README.md</w:t>
       </w:r>
     </w:p>
-    <w:tbl>
-      <w:tblPr>
-        <w:tblW w:type="auto" w:w="0"/>
+    <w:p>
+      <w:pPr>
+        <w:spacing w:before="120" w:after="120"/>
         <w:jc w:val="center"/>
-        <w:tblLook w:firstColumn="1" w:firstRow="1" w:lastColumn="0" w:lastRow="0" w:noHBand="0" w:noVBand="1" w:val="04A0"/>
-      </w:tblPr>
-      <w:tblGrid>
-        <w:gridCol w:w="9360"/>
-      </w:tblGrid>
-      <w:tr>
-        <w:tc>
-          <w:tcPr>
-            <w:tcW w:type="dxa" w:w="9360"/>
-            <w:shd w:fill="F1F5F9"/>
-            <w:tcMar>
-              <w:top w:w="120" w:type="dxa"/>
-              <w:bottom w:w="120" w:type="dxa"/>
-              <w:left w:w="200" w:type="dxa"/>
-              <w:right w:w="200" w:type="dxa"/>
-            </w:tcMar>
-            <w:tcBorders>
-              <w:left w:val="single" w:sz="24" w:space="0" w:color="006B3C"/>
-              <w:top w:val="none"/>
-              <w:right w:val="none"/>
-              <w:bottom w:val="none"/>
-            </w:tcBorders>
-          </w:tcPr>
-          <w:p>
-            <w:pPr>
-              <w:spacing w:before="40" w:after="40" w:line="276" w:lineRule="auto"/>
-            </w:pPr>
-            <w:r>
-              <w:rPr>
-                <w:rFonts w:ascii="Consolas" w:hAnsi="Consolas"/>
-                <w:color w:val="1E293B"/>
-                <w:sz w:val="19"/>
-              </w:rPr>
-              <w:t>**[🖼️ จุดใส่รูปภาพที่ 3: แคปหน้าจอ VS Code File Explorer แสดงโครงสร้างโฟลเดอร์ของโปรเจกต์]**</w:t>
-            </w:r>
-          </w:p>
-        </w:tc>
-      </w:tr>
-    </w:tbl>
+      </w:pPr>
+      <w:r>
+        <w:drawing>
+          <wp:inline xmlns:a="http://schemas.openxmlformats.org/drawingml/2006/main" xmlns:pic="http://schemas.openxmlformats.org/drawingml/2006/picture">
+            <wp:extent cx="5486400" cy="3429000"/>
+            <wp:docPr id="3" name="Picture 3"/>
+            <wp:cNvGraphicFramePr>
+              <a:graphicFrameLocks noChangeAspect="1"/>
+            </wp:cNvGraphicFramePr>
+            <a:graphic>
+              <a:graphicData uri="http://schemas.openxmlformats.org/drawingml/2006/picture">
+                <pic:pic>
+                  <pic:nvPicPr>
+                    <pic:cNvPr id="0" name="03_directory_tree.png"/>
+                    <pic:cNvPicPr/>
+                  </pic:nvPicPr>
+                  <pic:blipFill>
+                    <a:blip r:embed="rId11"/>
+                    <a:stretch>
+                      <a:fillRect/>
+                    </a:stretch>
+                  </pic:blipFill>
+                  <pic:spPr>
+                    <a:xfrm>
+                      <a:off x="0" y="0"/>
+                      <a:ext cx="5486400" cy="3429000"/>
+                    </a:xfrm>
+                    <a:prstGeom prst="rect"/>
+                  </pic:spPr>
+                </pic:pic>
+              </a:graphicData>
+            </a:graphic>
+          </wp:inline>
+        </w:drawing>
+      </w:r>
+    </w:p>
     <w:p>
       <w:pPr>
         <w:spacing w:before="120" w:after="120"/>
@@ -6887,49 +6878,46 @@
         </w:tc>
       </w:tr>
     </w:tbl>
-    <w:tbl>
-      <w:tblPr>
-        <w:tblW w:type="auto" w:w="0"/>
+    <w:p>
+      <w:pPr>
+        <w:spacing w:before="120" w:after="120"/>
         <w:jc w:val="center"/>
-        <w:tblLook w:firstColumn="1" w:firstRow="1" w:lastColumn="0" w:lastRow="0" w:noHBand="0" w:noVBand="1" w:val="04A0"/>
-      </w:tblPr>
-      <w:tblGrid>
-        <w:gridCol w:w="9360"/>
-      </w:tblGrid>
-      <w:tr>
-        <w:tc>
-          <w:tcPr>
-            <w:tcW w:type="dxa" w:w="9360"/>
-            <w:shd w:fill="F1F5F9"/>
-            <w:tcMar>
-              <w:top w:w="120" w:type="dxa"/>
-              <w:bottom w:w="120" w:type="dxa"/>
-              <w:left w:w="200" w:type="dxa"/>
-              <w:right w:w="200" w:type="dxa"/>
-            </w:tcMar>
-            <w:tcBorders>
-              <w:left w:val="single" w:sz="24" w:space="0" w:color="006B3C"/>
-              <w:top w:val="none"/>
-              <w:right w:val="none"/>
-              <w:bottom w:val="none"/>
-            </w:tcBorders>
-          </w:tcPr>
-          <w:p>
-            <w:pPr>
-              <w:spacing w:before="40" w:after="40" w:line="276" w:lineRule="auto"/>
-            </w:pPr>
-            <w:r>
-              <w:rPr>
-                <w:rFonts w:ascii="Consolas" w:hAnsi="Consolas"/>
-                <w:color w:val="1E293B"/>
-                <w:sz w:val="19"/>
-              </w:rPr>
-              <w:t>**[🖼️ จุดใส่รูปภาพที่ 4: แคปหน้าจอ Terminal ตอนรัน npx vitest run และ npx playwright test ผ่านครบ 100%]**</w:t>
-            </w:r>
-          </w:p>
-        </w:tc>
-      </w:tr>
-    </w:tbl>
+      </w:pPr>
+      <w:r>
+        <w:drawing>
+          <wp:inline xmlns:a="http://schemas.openxmlformats.org/drawingml/2006/main" xmlns:pic="http://schemas.openxmlformats.org/drawingml/2006/picture">
+            <wp:extent cx="5486400" cy="3429000"/>
+            <wp:docPr id="4" name="Picture 4"/>
+            <wp:cNvGraphicFramePr>
+              <a:graphicFrameLocks noChangeAspect="1"/>
+            </wp:cNvGraphicFramePr>
+            <a:graphic>
+              <a:graphicData uri="http://schemas.openxmlformats.org/drawingml/2006/picture">
+                <pic:pic>
+                  <pic:nvPicPr>
+                    <pic:cNvPr id="0" name="04_test_results.png"/>
+                    <pic:cNvPicPr/>
+                  </pic:nvPicPr>
+                  <pic:blipFill>
+                    <a:blip r:embed="rId12"/>
+                    <a:stretch>
+                      <a:fillRect/>
+                    </a:stretch>
+                  </pic:blipFill>
+                  <pic:spPr>
+                    <a:xfrm>
+                      <a:off x="0" y="0"/>
+                      <a:ext cx="5486400" cy="3429000"/>
+                    </a:xfrm>
+                    <a:prstGeom prst="rect"/>
+                  </pic:spPr>
+                </pic:pic>
+              </a:graphicData>
+            </a:graphic>
+          </wp:inline>
+        </w:drawing>
+      </w:r>
+    </w:p>
     <w:p>
       <w:pPr>
         <w:spacing w:before="120" w:after="120"/>
@@ -8036,49 +8024,46 @@
         <w:t>หน้าจอเลือกสิทธิ์ผู้ใช้งานจำลอง (Development Requester Selector) มี Dropdown และปุ่ม Continue</w:t>
       </w:r>
     </w:p>
-    <w:tbl>
-      <w:tblPr>
-        <w:tblW w:type="auto" w:w="0"/>
+    <w:p>
+      <w:pPr>
+        <w:spacing w:before="120" w:after="120"/>
         <w:jc w:val="center"/>
-        <w:tblLook w:firstColumn="1" w:firstRow="1" w:lastColumn="0" w:lastRow="0" w:noHBand="0" w:noVBand="1" w:val="04A0"/>
-      </w:tblPr>
-      <w:tblGrid>
-        <w:gridCol w:w="9360"/>
-      </w:tblGrid>
-      <w:tr>
-        <w:tc>
-          <w:tcPr>
-            <w:tcW w:type="dxa" w:w="9360"/>
-            <w:shd w:fill="F1F5F9"/>
-            <w:tcMar>
-              <w:top w:w="120" w:type="dxa"/>
-              <w:bottom w:w="120" w:type="dxa"/>
-              <w:left w:w="200" w:type="dxa"/>
-              <w:right w:w="200" w:type="dxa"/>
-            </w:tcMar>
-            <w:tcBorders>
-              <w:left w:val="single" w:sz="24" w:space="0" w:color="006B3C"/>
-              <w:top w:val="none"/>
-              <w:right w:val="none"/>
-              <w:bottom w:val="none"/>
-            </w:tcBorders>
-          </w:tcPr>
-          <w:p>
-            <w:pPr>
-              <w:spacing w:before="40" w:after="40" w:line="276" w:lineRule="auto"/>
-            </w:pPr>
-            <w:r>
-              <w:rPr>
-                <w:rFonts w:ascii="Consolas" w:hAnsi="Consolas"/>
-                <w:color w:val="1E293B"/>
-                <w:sz w:val="19"/>
-              </w:rPr>
-              <w:t>**[🖼️ จุดใส่รูปภาพที่ 5: แคปหน้าจอเว็บ Requester Selector Screen]**</w:t>
-            </w:r>
-          </w:p>
-        </w:tc>
-      </w:tr>
-    </w:tbl>
+      </w:pPr>
+      <w:r>
+        <w:drawing>
+          <wp:inline xmlns:a="http://schemas.openxmlformats.org/drawingml/2006/main" xmlns:pic="http://schemas.openxmlformats.org/drawingml/2006/picture">
+            <wp:extent cx="5486400" cy="3429000"/>
+            <wp:docPr id="5" name="Picture 5"/>
+            <wp:cNvGraphicFramePr>
+              <a:graphicFrameLocks noChangeAspect="1"/>
+            </wp:cNvGraphicFramePr>
+            <a:graphic>
+              <a:graphicData uri="http://schemas.openxmlformats.org/drawingml/2006/picture">
+                <pic:pic>
+                  <pic:nvPicPr>
+                    <pic:cNvPr id="0" name="05_requester_selector.png"/>
+                    <pic:cNvPicPr/>
+                  </pic:nvPicPr>
+                  <pic:blipFill>
+                    <a:blip r:embed="rId13"/>
+                    <a:stretch>
+                      <a:fillRect/>
+                    </a:stretch>
+                  </pic:blipFill>
+                  <pic:spPr>
+                    <a:xfrm>
+                      <a:off x="0" y="0"/>
+                      <a:ext cx="5486400" cy="3429000"/>
+                    </a:xfrm>
+                    <a:prstGeom prst="rect"/>
+                  </pic:spPr>
+                </pic:pic>
+              </a:graphicData>
+            </a:graphic>
+          </wp:inline>
+        </w:drawing>
+      </w:r>
+    </w:p>
     <w:p>
       <w:pPr>
         <w:spacing w:before="120" w:after="120"/>
@@ -8114,49 +8099,46 @@
         <w:t>หน้าจอบันทึกตั๋วปัญหาแจ้งซ่อม IT มีเครื่องหมายดอกจันสีแดงแสดงฟิลด์บังคับ การดักจับ Validation Error และโซนอัปโหลดไฟล์แนบ</w:t>
       </w:r>
     </w:p>
-    <w:tbl>
-      <w:tblPr>
-        <w:tblW w:type="auto" w:w="0"/>
+    <w:p>
+      <w:pPr>
+        <w:spacing w:before="120" w:after="120"/>
         <w:jc w:val="center"/>
-        <w:tblLook w:firstColumn="1" w:firstRow="1" w:lastColumn="0" w:lastRow="0" w:noHBand="0" w:noVBand="1" w:val="04A0"/>
-      </w:tblPr>
-      <w:tblGrid>
-        <w:gridCol w:w="9360"/>
-      </w:tblGrid>
-      <w:tr>
-        <w:tc>
-          <w:tcPr>
-            <w:tcW w:type="dxa" w:w="9360"/>
-            <w:shd w:fill="F1F5F9"/>
-            <w:tcMar>
-              <w:top w:w="120" w:type="dxa"/>
-              <w:bottom w:w="120" w:type="dxa"/>
-              <w:left w:w="200" w:type="dxa"/>
-              <w:right w:w="200" w:type="dxa"/>
-            </w:tcMar>
-            <w:tcBorders>
-              <w:left w:val="single" w:sz="24" w:space="0" w:color="006B3C"/>
-              <w:top w:val="none"/>
-              <w:right w:val="none"/>
-              <w:bottom w:val="none"/>
-            </w:tcBorders>
-          </w:tcPr>
-          <w:p>
-            <w:pPr>
-              <w:spacing w:before="40" w:after="40" w:line="276" w:lineRule="auto"/>
-            </w:pPr>
-            <w:r>
-              <w:rPr>
-                <w:rFonts w:ascii="Consolas" w:hAnsi="Consolas"/>
-                <w:color w:val="1E293B"/>
-                <w:sz w:val="19"/>
-              </w:rPr>
-              <w:t>**[🖼️ จุดใส่รูปภาพที่ 6: แคปหน้าจอเว็บ Create Ticket Form UI]**</w:t>
-            </w:r>
-          </w:p>
-        </w:tc>
-      </w:tr>
-    </w:tbl>
+      </w:pPr>
+      <w:r>
+        <w:drawing>
+          <wp:inline xmlns:a="http://schemas.openxmlformats.org/drawingml/2006/main" xmlns:pic="http://schemas.openxmlformats.org/drawingml/2006/picture">
+            <wp:extent cx="5486400" cy="3429000"/>
+            <wp:docPr id="6" name="Picture 6"/>
+            <wp:cNvGraphicFramePr>
+              <a:graphicFrameLocks noChangeAspect="1"/>
+            </wp:cNvGraphicFramePr>
+            <a:graphic>
+              <a:graphicData uri="http://schemas.openxmlformats.org/drawingml/2006/picture">
+                <pic:pic>
+                  <pic:nvPicPr>
+                    <pic:cNvPr id="0" name="06_create_ticket_form.png"/>
+                    <pic:cNvPicPr/>
+                  </pic:nvPicPr>
+                  <pic:blipFill>
+                    <a:blip r:embed="rId14"/>
+                    <a:stretch>
+                      <a:fillRect/>
+                    </a:stretch>
+                  </pic:blipFill>
+                  <pic:spPr>
+                    <a:xfrm>
+                      <a:off x="0" y="0"/>
+                      <a:ext cx="5486400" cy="3429000"/>
+                    </a:xfrm>
+                    <a:prstGeom prst="rect"/>
+                  </pic:spPr>
+                </pic:pic>
+              </a:graphicData>
+            </a:graphic>
+          </wp:inline>
+        </w:drawing>
+      </w:r>
+    </w:p>
     <w:p>
       <w:pPr>
         <w:spacing w:before="120" w:after="120"/>
@@ -8192,49 +8174,46 @@
         <w:t>หน้าจอแดชบอร์ดแสดงรายการตั๋วของผู้ใช้ มีช่องค้นหา ตัวกรองสถานะ/ความสำคัญ ตารางตั๋วพร้อม Badge สี และปุ่มเปลี่ยนหน้า (Pagination)</w:t>
       </w:r>
     </w:p>
-    <w:tbl>
-      <w:tblPr>
-        <w:tblW w:type="auto" w:w="0"/>
+    <w:p>
+      <w:pPr>
+        <w:spacing w:before="120" w:after="120"/>
         <w:jc w:val="center"/>
-        <w:tblLook w:firstColumn="1" w:firstRow="1" w:lastColumn="0" w:lastRow="0" w:noHBand="0" w:noVBand="1" w:val="04A0"/>
-      </w:tblPr>
-      <w:tblGrid>
-        <w:gridCol w:w="9360"/>
-      </w:tblGrid>
-      <w:tr>
-        <w:tc>
-          <w:tcPr>
-            <w:tcW w:type="dxa" w:w="9360"/>
-            <w:shd w:fill="F1F5F9"/>
-            <w:tcMar>
-              <w:top w:w="120" w:type="dxa"/>
-              <w:bottom w:w="120" w:type="dxa"/>
-              <w:left w:w="200" w:type="dxa"/>
-              <w:right w:w="200" w:type="dxa"/>
-            </w:tcMar>
-            <w:tcBorders>
-              <w:left w:val="single" w:sz="24" w:space="0" w:color="006B3C"/>
-              <w:top w:val="none"/>
-              <w:right w:val="none"/>
-              <w:bottom w:val="none"/>
-            </w:tcBorders>
-          </w:tcPr>
-          <w:p>
-            <w:pPr>
-              <w:spacing w:before="40" w:after="40" w:line="276" w:lineRule="auto"/>
-            </w:pPr>
-            <w:r>
-              <w:rPr>
-                <w:rFonts w:ascii="Consolas" w:hAnsi="Consolas"/>
-                <w:color w:val="1E293B"/>
-                <w:sz w:val="19"/>
-              </w:rPr>
-              <w:t>**[🖼️ จุดใส่รูปภาพที่ 7: แคปหน้าจอเว็บ My Tickets Dashboard]**</w:t>
-            </w:r>
-          </w:p>
-        </w:tc>
-      </w:tr>
-    </w:tbl>
+      </w:pPr>
+      <w:r>
+        <w:drawing>
+          <wp:inline xmlns:a="http://schemas.openxmlformats.org/drawingml/2006/main" xmlns:pic="http://schemas.openxmlformats.org/drawingml/2006/picture">
+            <wp:extent cx="5486400" cy="3429000"/>
+            <wp:docPr id="7" name="Picture 7"/>
+            <wp:cNvGraphicFramePr>
+              <a:graphicFrameLocks noChangeAspect="1"/>
+            </wp:cNvGraphicFramePr>
+            <a:graphic>
+              <a:graphicData uri="http://schemas.openxmlformats.org/drawingml/2006/picture">
+                <pic:pic>
+                  <pic:nvPicPr>
+                    <pic:cNvPr id="0" name="07_my_tickets_dashboard.png"/>
+                    <pic:cNvPicPr/>
+                  </pic:nvPicPr>
+                  <pic:blipFill>
+                    <a:blip r:embed="rId15"/>
+                    <a:stretch>
+                      <a:fillRect/>
+                    </a:stretch>
+                  </pic:blipFill>
+                  <pic:spPr>
+                    <a:xfrm>
+                      <a:off x="0" y="0"/>
+                      <a:ext cx="5486400" cy="3429000"/>
+                    </a:xfrm>
+                    <a:prstGeom prst="rect"/>
+                  </pic:spPr>
+                </pic:pic>
+              </a:graphicData>
+            </a:graphic>
+          </wp:inline>
+        </w:drawing>
+      </w:r>
+    </w:p>
     <w:p>
       <w:pPr>
         <w:spacing w:before="120" w:after="120"/>
@@ -8270,49 +8249,46 @@
         <w:t>หน้าจอแสดงรายละเอียดตั๋วแบบ Read-Only รายการไฟล์แนบ ปุ่มอัปโหลดไฟล์เพิ่ม และระบบ Soft-remove พร้อมกรอกเหตุผลในการลบ</w:t>
       </w:r>
     </w:p>
-    <w:tbl>
-      <w:tblPr>
-        <w:tblW w:type="auto" w:w="0"/>
+    <w:p>
+      <w:pPr>
+        <w:spacing w:before="120" w:after="120"/>
         <w:jc w:val="center"/>
-        <w:tblLook w:firstColumn="1" w:firstRow="1" w:lastColumn="0" w:lastRow="0" w:noHBand="0" w:noVBand="1" w:val="04A0"/>
-      </w:tblPr>
-      <w:tblGrid>
-        <w:gridCol w:w="9360"/>
-      </w:tblGrid>
-      <w:tr>
-        <w:tc>
-          <w:tcPr>
-            <w:tcW w:type="dxa" w:w="9360"/>
-            <w:shd w:fill="F1F5F9"/>
-            <w:tcMar>
-              <w:top w:w="120" w:type="dxa"/>
-              <w:bottom w:w="120" w:type="dxa"/>
-              <w:left w:w="200" w:type="dxa"/>
-              <w:right w:w="200" w:type="dxa"/>
-            </w:tcMar>
-            <w:tcBorders>
-              <w:left w:val="single" w:sz="24" w:space="0" w:color="006B3C"/>
-              <w:top w:val="none"/>
-              <w:right w:val="none"/>
-              <w:bottom w:val="none"/>
-            </w:tcBorders>
-          </w:tcPr>
-          <w:p>
-            <w:pPr>
-              <w:spacing w:before="40" w:after="40" w:line="276" w:lineRule="auto"/>
-            </w:pPr>
-            <w:r>
-              <w:rPr>
-                <w:rFonts w:ascii="Consolas" w:hAnsi="Consolas"/>
-                <w:color w:val="1E293B"/>
-                <w:sz w:val="19"/>
-              </w:rPr>
-              <w:t>**[🖼️ จุดใส่รูปภาพที่ 8: แคปหน้าจอเว็บ Ticket Detail View และ Modal ลบไฟล์แนบ]**</w:t>
-            </w:r>
-          </w:p>
-        </w:tc>
-      </w:tr>
-    </w:tbl>
+      </w:pPr>
+      <w:r>
+        <w:drawing>
+          <wp:inline xmlns:a="http://schemas.openxmlformats.org/drawingml/2006/main" xmlns:pic="http://schemas.openxmlformats.org/drawingml/2006/picture">
+            <wp:extent cx="5486400" cy="3429000"/>
+            <wp:docPr id="8" name="Picture 8"/>
+            <wp:cNvGraphicFramePr>
+              <a:graphicFrameLocks noChangeAspect="1"/>
+            </wp:cNvGraphicFramePr>
+            <a:graphic>
+              <a:graphicData uri="http://schemas.openxmlformats.org/drawingml/2006/picture">
+                <pic:pic>
+                  <pic:nvPicPr>
+                    <pic:cNvPr id="0" name="08_ticket_detail_modal.png"/>
+                    <pic:cNvPicPr/>
+                  </pic:nvPicPr>
+                  <pic:blipFill>
+                    <a:blip r:embed="rId16"/>
+                    <a:stretch>
+                      <a:fillRect/>
+                    </a:stretch>
+                  </pic:blipFill>
+                  <pic:spPr>
+                    <a:xfrm>
+                      <a:off x="0" y="0"/>
+                      <a:ext cx="5486400" cy="3429000"/>
+                    </a:xfrm>
+                    <a:prstGeom prst="rect"/>
+                  </pic:spPr>
+                </pic:pic>
+              </a:graphicData>
+            </a:graphic>
+          </wp:inline>
+        </w:drawing>
+      </w:r>
+    </w:p>
     <w:sectPr>
       <w:pgSz w:w="12240" w:h="15840"/>
       <w:pgMar w:top="1440" w:right="1440" w:bottom="1440" w:left="1440" w:header="720" w:footer="720" w:gutter="0"/>

</xml_diff>